<commit_message>
Simplify sales calls story draft and use a fictional Ltd company
Co-Authored-By: Claude Opus 5.5 <noreply@anthropic.com>
Claude-Session: https://claude.ai/code/session_01Xs6uEGTRa4UggVmKjUH61X
</commit_message>
<xml_diff>
--- a/content/use-cases/story-drafts/Lynkk-Sales-Calls-Story-Draft.docx
+++ b/content/use-cases/story-drafts/Lynkk-Sales-Calls-Story-Draft.docx
@@ -7,7 +7,7 @@
         <w:pStyle w:val="Title"/>
       </w:pPr>
       <w:r>
-        <w:t xml:space="preserve">Sales Calls Page: Storytelling Draft</w:t>
+        <w:t xml:space="preserve">Sales Calls Page: Storytelling Draft (v2)</w:t>
       </w:r>
     </w:p>
     <w:p>
@@ -20,7 +20,7 @@
         <w:ind w:left="360"/>
       </w:pPr>
       <w:r>
-        <w:t xml:space="preserve">Draft for review, 2026-10-17. Page: lynkk.ai/use-cases/sales-calls. The story follows Maya, an example sales rep (not a real customer), so readers can see themselves in it. Once this style is approved, the other 9 pages follow the same pattern.</w:t>
+        <w:t xml:space="preserve">Draft for review, 2026-10-17. Page: lynkk.ai/use-cases/sales-calls. The story follows Maya, an example sales rep, and Bluestone Logistics Ltd., an example company. Neither is a real customer.</w:t>
       </w:r>
     </w:p>
     <w:p>
@@ -737,86 +737,6 @@
     </w:p>
     <w:p>
       <w:pPr>
-        <w:pStyle w:val="Heading1"/>
-      </w:pPr>
-      <w:r>
-        <w:t xml:space="preserve">Google checklist for this draft</w:t>
-      </w:r>
-    </w:p>
-    <w:p>
-      <w:pPr>
-        <w:pStyle w:val="ListParagraph"/>
-        <w:numPr>
-          <w:ilvl w:val="0"/>
-          <w:numId w:val="2"/>
-        </w:numPr>
-      </w:pPr>
-      <w:r>
-        <w:t xml:space="preserve">One clear H1 that says what the page is about, with the main keyword</w:t>
-      </w:r>
-    </w:p>
-    <w:p>
-      <w:pPr>
-        <w:pStyle w:val="ListParagraph"/>
-        <w:numPr>
-          <w:ilvl w:val="0"/>
-          <w:numId w:val="2"/>
-        </w:numPr>
-      </w:pPr>
-      <w:r>
-        <w:t xml:space="preserve">Unique title tag and meta description</w:t>
-      </w:r>
-    </w:p>
-    <w:p>
-      <w:pPr>
-        <w:pStyle w:val="ListParagraph"/>
-        <w:numPr>
-          <w:ilvl w:val="0"/>
-          <w:numId w:val="2"/>
-        </w:numPr>
-      </w:pPr>
-      <w:r>
-        <w:t xml:space="preserve">Story first, then plain facts (what it is, who it's for, features, pricing, FAQ)</w:t>
-      </w:r>
-    </w:p>
-    <w:p>
-      <w:pPr>
-        <w:pStyle w:val="ListParagraph"/>
-        <w:numPr>
-          <w:ilvl w:val="0"/>
-          <w:numId w:val="2"/>
-        </w:numPr>
-      </w:pPr>
-      <w:r>
-        <w:t xml:space="preserve">A real sample note written as text, so Google and AI Overviews can read it</w:t>
-      </w:r>
-    </w:p>
-    <w:p>
-      <w:pPr>
-        <w:pStyle w:val="ListParagraph"/>
-        <w:numPr>
-          <w:ilvl w:val="0"/>
-          <w:numId w:val="2"/>
-        </w:numPr>
-      </w:pPr>
-      <w:r>
-        <w:t xml:space="preserve">Honest limits (no CRM sync), no made-up numbers or testimonials</w:t>
-      </w:r>
-    </w:p>
-    <w:p>
-      <w:pPr>
-        <w:pStyle w:val="ListParagraph"/>
-        <w:numPr>
-          <w:ilvl w:val="0"/>
-          <w:numId w:val="2"/>
-        </w:numPr>
-      </w:pPr>
-      <w:r>
-        <w:t xml:space="preserve">The story is clearly labelled as an example</w:t>
-      </w:r>
-    </w:p>
-    <w:p>
-      <w:pPr>
         <w:pBdr>
           <w:bottom w:val="single" w:color="C9D3DF" w:sz="6" w:space="1"/>
         </w:pBdr>
@@ -1045,7 +965,7 @@
         <w:spacing w:after="140"/>
       </w:pPr>
       <w:r>
-        <w:t xml:space="preserve">Lynkk is AI for sales teams who would rather sell than type. It records your sales call on Zoom, Google Meet, Microsoft Teams or in person, and writes the next steps, the decisions and the open questions for you.</w:t>
+        <w:t xml:space="preserve">Lynkk is AI for sales teams who would rather sell than type. It records your sales call and writes the next steps, the decisions and the open questions for you.</w:t>
       </w:r>
     </w:p>
     <w:p>
@@ -1073,133 +993,102 @@
           <w:i/>
           <w:iCs/>
         </w:rPr>
-        <w:t xml:space="preserve">Meet Maya. She's an example, but you may know someone just like her.</w:t>
-      </w:r>
-    </w:p>
-    <w:p>
-      <w:pPr>
-        <w:spacing w:after="140"/>
-      </w:pPr>
-      <w:r>
-        <w:t xml:space="preserve">Maya is an account executive. On Tuesday she has four sales calls back to back. At 2 pm she's on Zoom with Dana from Acme. Dana has questions about pricing, wants to try the product with two teams first, and asks who on Acme's side needs to sign off.</w:t>
-      </w:r>
-    </w:p>
-    <w:p>
-      <w:pPr>
-        <w:spacing w:after="140"/>
-      </w:pPr>
-      <w:r>
-        <w:t xml:space="preserve">Maya is doing three jobs at once. She's selling, she's listening, and she's trying to type notes. She promises a revised quote by Friday. Her colleague Dev says he'll book a security review. Dana mentions, almost in passing, that she isn't sure who signs the annual order.</w:t>
-      </w:r>
-    </w:p>
-    <w:p>
-      <w:pPr>
-        <w:spacing w:after="140"/>
-      </w:pPr>
-      <w:r>
-        <w:t xml:space="preserve">At 6 pm Maya opens her notes. They say: </w:t>
+        <w:t xml:space="preserve">Meet Maya, a sales rep. She's an example, but you may know someone just like her.</w:t>
+      </w:r>
+    </w:p>
+    <w:p>
+      <w:pPr>
+        <w:spacing w:after="140"/>
+      </w:pPr>
+      <w:r>
+        <w:t xml:space="preserve">Maya has a sales call with Dana from Bluestone Logistics Ltd. Dana asks about the price, wants to try the product with two teams first, and isn't sure who on her side will sign the order.</w:t>
+      </w:r>
+    </w:p>
+    <w:p>
+      <w:pPr>
+        <w:spacing w:after="140"/>
+      </w:pPr>
+      <w:r>
+        <w:t xml:space="preserve">Maya is selling, listening and typing notes all at once. After the call, her notes are half done. She can't remember when she promised the new quote, and Dana's question about who signs the order is gone.</w:t>
+      </w:r>
+    </w:p>
+    <w:p>
+      <w:pPr>
+        <w:spacing w:after="140"/>
+      </w:pPr>
+      <w:r>
+        <w:t xml:space="preserve">The follow-up email goes out late. Small things slip, and the deal slows down.</w:t>
+      </w:r>
+    </w:p>
+    <w:p>
+      <w:pPr>
+        <w:pStyle w:val="Heading1"/>
+      </w:pPr>
+      <w:r>
+        <w:t xml:space="preserve">How an AI sales assistant helps Maya</w:t>
+      </w:r>
+    </w:p>
+    <w:p>
+      <w:pPr>
+        <w:spacing w:after="140"/>
+      </w:pPr>
+      <w:r>
+        <w:t xml:space="preserve">On her next call with Bluestone Logistics, Maya uses Lynkk.</w:t>
+      </w:r>
+    </w:p>
+    <w:p>
+      <w:pPr>
+        <w:spacing w:after="140"/>
+      </w:pPr>
+      <w:r>
+        <w:rPr>
+          <w:b/>
+          <w:bCs/>
+        </w:rPr>
+        <w:t xml:space="preserve">Before the call:</w:t>
+      </w:r>
+      <w:r>
+        <w:t xml:space="preserve"> Maya asks Lynkk, </w:t>
       </w:r>
       <w:r>
         <w:rPr>
           <w:i/>
           <w:iCs/>
         </w:rPr>
-        <w:t xml:space="preserve">"pricing?? pilot 2 teams. sec review. Fri."</w:t>
-      </w:r>
-      <w:r>
-        <w:t xml:space="preserve"> Who promised the quote? Was it Friday the 2nd or the 9th? And what was that thing about the annual order? The follow-up email waits until 9 pm, and the open question about who signs never makes it in.</w:t>
-      </w:r>
-    </w:p>
-    <w:p>
-      <w:pPr>
-        <w:spacing w:after="140"/>
-      </w:pPr>
-      <w:r>
-        <w:t xml:space="preserve">A week later, the deal slows down. Not because Maya sold badly, but because a few small things slipped.</w:t>
-      </w:r>
-    </w:p>
-    <w:p>
-      <w:pPr>
-        <w:pStyle w:val="Heading1"/>
-      </w:pPr>
-      <w:r>
-        <w:t xml:space="preserve">How an AI sales assistant changed Maya's next call</w:t>
-      </w:r>
-    </w:p>
-    <w:p>
-      <w:pPr>
-        <w:spacing w:after="140"/>
-      </w:pPr>
-      <w:r>
-        <w:t xml:space="preserve">Before her next call with Acme, Maya starts using Lynkk.</w:t>
-      </w:r>
-    </w:p>
-    <w:p>
-      <w:pPr>
-        <w:pStyle w:val="Heading2"/>
-      </w:pPr>
-      <w:r>
-        <w:t xml:space="preserve">Before the call: she starts ahead</w:t>
-      </w:r>
-    </w:p>
-    <w:p>
-      <w:pPr>
-        <w:spacing w:after="140"/>
-      </w:pPr>
-      <w:r>
-        <w:t xml:space="preserve">Ten minutes before the call, Maya asks Lynkk: </w:t>
-      </w:r>
+        <w:t xml:space="preserve">"What's still open with Bluestone?"</w:t>
+      </w:r>
+      <w:r>
+        <w:t xml:space="preserve"> Lynkk reminds her that Dana still hasn't said who signs the order. Maya starts the call with that question.</w:t>
+      </w:r>
+    </w:p>
+    <w:p>
+      <w:pPr>
+        <w:spacing w:after="140"/>
+      </w:pPr>
       <w:r>
         <w:rPr>
-          <w:i/>
-          <w:iCs/>
+          <w:b/>
+          <w:bCs/>
         </w:rPr>
-        <w:t xml:space="preserve">"What's still open with Acme?"</w:t>
-      </w:r>
-      <w:r>
-        <w:t xml:space="preserve"> Lynkk answers from her past calls: Dana still hasn't said who signs the annual order, and it links to the exact moment she raised it. Maya opens the call with that question.</w:t>
-      </w:r>
-    </w:p>
-    <w:p>
-      <w:pPr>
-        <w:pStyle w:val="Heading2"/>
-      </w:pPr>
-      <w:r>
-        <w:t xml:space="preserve">During the call: she just listens</w:t>
-      </w:r>
-    </w:p>
-    <w:p>
-      <w:pPr>
-        <w:spacing w:after="140"/>
-      </w:pPr>
-      <w:r>
-        <w:t xml:space="preserve">When the Zoom call starts, the Lynkk Mac app offers to record. Nothing new joins the call, so the conversation feels normal. Halfway through, Dana asks: </w:t>
-      </w:r>
+        <w:t xml:space="preserve">During the call:</w:t>
+      </w:r>
+      <w:r>
+        <w:t xml:space="preserve"> Lynkk records the call from her Mac, so no bot joins. Maya just listens and talks. When Dana asks what they agreed last time, Lynkk's Cue gives Maya the answer during the call.</w:t>
+      </w:r>
+    </w:p>
+    <w:p>
+      <w:pPr>
+        <w:spacing w:after="140"/>
+      </w:pPr>
       <w:r>
         <w:rPr>
-          <w:i/>
-          <w:iCs/>
+          <w:b/>
+          <w:bCs/>
         </w:rPr>
-        <w:t xml:space="preserve">"What did we agree on the pilot size?"</w:t>
-      </w:r>
-      <w:r>
-        <w:t xml:space="preserve"> Instead of scrolling through old notes, Maya gets the answer from Cue during the call: a pilot for two teams, agreed on the first call.</w:t>
-      </w:r>
-    </w:p>
-    <w:p>
-      <w:pPr>
-        <w:pStyle w:val="Heading2"/>
-      </w:pPr>
-      <w:r>
-        <w:t xml:space="preserve">After the call: the note is already written</w:t>
-      </w:r>
-    </w:p>
-    <w:p>
-      <w:pPr>
-        <w:spacing w:after="140"/>
-      </w:pPr>
-      <w:r>
-        <w:t xml:space="preserve">By the time Maya is back in her inbox, the note is ready. Every next step has an owner and a date. She writes the follow-up email straight from the note, and sends the action items to Jira so the security review isn't forgotten.</w:t>
+        <w:t xml:space="preserve">After the call:</w:t>
+      </w:r>
+      <w:r>
+        <w:t xml:space="preserve"> the note is ready before Maya opens her inbox. Every next step has an owner and a date. She writes the follow-up from the note and sends the tasks to Jira.</w:t>
       </w:r>
     </w:p>
     <w:p>
@@ -1219,7 +1108,7 @@
         <w:pStyle w:val="Heading2"/>
       </w:pPr>
       <w:r>
-        <w:t xml:space="preserve">Maya's note from the Acme call (example)</w:t>
+        <w:t xml:space="preserve">Maya's note from the call (example)</w:t>
       </w:r>
     </w:p>
     <w:p>
@@ -1231,7 +1120,7 @@
           <w:b/>
           <w:bCs/>
         </w:rPr>
-        <w:t xml:space="preserve">Acme pricing call · Zoom · 32 min</w:t>
+        <w:t xml:space="preserve">Bluestone Logistics Ltd. pricing call · Zoom · 32 min</w:t>
       </w:r>
     </w:p>
     <w:p>
@@ -1255,7 +1144,7 @@
         </w:numPr>
       </w:pPr>
       <w:r>
-        <w:t xml:space="preserve">Send the revised quote to Dana. Owner: Maya. Due: Fri 2 Oct.</w:t>
+        <w:t xml:space="preserve">Send the new quote to Dana. Owner: Maya. Due: Fri 2 Oct.</w:t>
       </w:r>
     </w:p>
     <w:p>
@@ -1272,18 +1161,6 @@
     </w:p>
     <w:p>
       <w:pPr>
-        <w:pStyle w:val="ListParagraph"/>
-        <w:numPr>
-          <w:ilvl w:val="0"/>
-          <w:numId w:val="2"/>
-        </w:numPr>
-      </w:pPr>
-      <w:r>
-        <w:t xml:space="preserve">Share the pilot plan for two teams. Owner: Maya. Due: Fri 9 Oct.</w:t>
-      </w:r>
-    </w:p>
-    <w:p>
-      <w:pPr>
         <w:spacing w:after="140"/>
       </w:pPr>
       <w:r>
@@ -1309,30 +1186,15 @@
         <w:t xml:space="preserve">Open question:</w:t>
       </w:r>
       <w:r>
-        <w:t xml:space="preserve"> Who signs the annual order on Acme's side? Raised at 21:37.</w:t>
-      </w:r>
-    </w:p>
-    <w:p>
-      <w:pPr>
-        <w:spacing w:after="140"/>
-      </w:pPr>
-      <w:r>
-        <w:rPr>
-          <w:b/>
-          <w:bCs/>
-        </w:rPr>
-        <w:t xml:space="preserve">Key takeaways:</w:t>
-      </w:r>
-      <w:r>
-        <w:t xml:space="preserve"> 08:12 Pricing is the main question for Acme. 17:50 They want two teams on it before a wider rollout.</w:t>
-      </w:r>
-    </w:p>
-    <w:p>
-      <w:pPr>
-        <w:spacing w:after="140"/>
-      </w:pPr>
-      <w:r>
-        <w:t xml:space="preserve">Every time in the note plays the recording from that moment, so Maya can hear exactly how Dana said it.</w:t>
+        <w:t xml:space="preserve"> Who signs the order on Bluestone's side? Raised at 21:37.</w:t>
+      </w:r>
+    </w:p>
+    <w:p>
+      <w:pPr>
+        <w:spacing w:after="140"/>
+      </w:pPr>
+      <w:r>
+        <w:t xml:space="preserve">Click any time in the note and the recording plays from that moment.</w:t>
       </w:r>
     </w:p>
     <w:p>
@@ -1348,7 +1210,7 @@
         <w:spacing w:after="140"/>
       </w:pPr>
       <w:r>
-        <w:t xml:space="preserve">Lynkk is an AI sales assistant and conversation intelligence platform. In plain words: it listens to your sales call, writes down what matters, and remembers it for next time. You get the next steps, who owns them, the decisions and the open questions. Later, you can ask Lynkk questions about any account, and each answer shows which call it came from.</w:t>
+        <w:t xml:space="preserve">Lynkk is an AI sales assistant and conversation intelligence platform. It listens to your sales call, writes down what matters, and remembers it for next time. You get the next steps, who owns them, the decisions and the open questions. Later, you can ask Lynkk about any client, and each answer shows which call it came from.</w:t>
       </w:r>
     </w:p>
     <w:p>
@@ -1659,63 +1521,6 @@
           </w:p>
         </w:tc>
       </w:tr>
-      <w:tr>
-        <w:trPr>
-          <w:tblHeader w:val="false"/>
-        </w:trPr>
-        <w:tc>
-          <w:tcPr>
-            <w:tcW w:type="dxa" w:w="5040"/>
-            <w:tcBorders>
-              <w:top w:val="single" w:color="C9D3DF" w:sz="4"/>
-              <w:left w:val="single" w:color="C9D3DF" w:sz="4"/>
-              <w:bottom w:val="single" w:color="C9D3DF" w:sz="4"/>
-              <w:right w:val="single" w:color="C9D3DF" w:sz="4"/>
-            </w:tcBorders>
-            <w:tcMar>
-              <w:top w:type="dxa" w:w="60"/>
-              <w:left w:type="dxa" w:w="100"/>
-              <w:bottom w:type="dxa" w:w="60"/>
-              <w:right w:type="dxa" w:w="100"/>
-            </w:tcMar>
-          </w:tcPr>
-          <w:p>
-            <w:r>
-              <w:rPr>
-                <w:sz w:val="19"/>
-                <w:szCs w:val="19"/>
-              </w:rPr>
-              <w:t xml:space="preserve">Small questions slip through the cracks</w:t>
-            </w:r>
-          </w:p>
-        </w:tc>
-        <w:tc>
-          <w:tcPr>
-            <w:tcW w:type="dxa" w:w="5040"/>
-            <w:tcBorders>
-              <w:top w:val="single" w:color="C9D3DF" w:sz="4"/>
-              <w:left w:val="single" w:color="C9D3DF" w:sz="4"/>
-              <w:bottom w:val="single" w:color="C9D3DF" w:sz="4"/>
-              <w:right w:val="single" w:color="C9D3DF" w:sz="4"/>
-            </w:tcBorders>
-            <w:tcMar>
-              <w:top w:type="dxa" w:w="60"/>
-              <w:left w:type="dxa" w:w="100"/>
-              <w:bottom w:type="dxa" w:w="60"/>
-              <w:right w:type="dxa" w:w="100"/>
-            </w:tcMar>
-          </w:tcPr>
-          <w:p>
-            <w:r>
-              <w:rPr>
-                <w:sz w:val="19"/>
-                <w:szCs w:val="19"/>
-              </w:rPr>
-              <w:t xml:space="preserve">Open questions are listed, with the moment they were asked</w:t>
-            </w:r>
-          </w:p>
-        </w:tc>
-      </w:tr>
     </w:tbl>
     <w:p>
       <w:pPr>
@@ -1742,7 +1547,7 @@
         <w:t xml:space="preserve">Next steps with owners:</w:t>
       </w:r>
       <w:r>
-        <w:t xml:space="preserve"> every action item gets an owner, a due date and a priority.</w:t>
+        <w:t xml:space="preserve"> every task gets an owner, a due date and a priority.</w:t>
       </w:r>
     </w:p>
     <w:p>
@@ -1757,7 +1562,7 @@
         <w:t xml:space="preserve">Ask across calls:</w:t>
       </w:r>
       <w:r>
-        <w:t xml:space="preserve"> "What did Acme say about pricing?" Each answer shows which call it came from.</w:t>
+        <w:t xml:space="preserve"> "What did Bluestone say about price?" Each answer shows which call it came from.</w:t>
       </w:r>
     </w:p>
     <w:p>
@@ -1772,7 +1577,7 @@
         <w:t xml:space="preserve">Record in person, even offline:</w:t>
       </w:r>
       <w:r>
-        <w:t xml:space="preserve"> meeting a buyer face to face? Record the room with the Mac app or web app. With no signal, it uploads when you're back online.</w:t>
+        <w:t xml:space="preserve"> meeting a buyer face to face? Record with the Mac app or web app. It uploads when you're back online.</w:t>
       </w:r>
     </w:p>
     <w:p>
@@ -1820,7 +1625,7 @@
       <w:r>
         <w:t xml:space="preserve">Your data region (US, EU, UK, India, Singapore or Australia) · AES-256 encryption · Never used for training · Consent flow for recording. </w:t>
       </w:r>
-      <w:hyperlink w:history="1" r:id="rId9awmnxc0lluwohenysurs">
+      <w:hyperlink w:history="1" r:id="rId7ccy9iaqpvvqnceb9d3yk">
         <w:r>
           <w:rPr>
             <w:rStyle w:val="Hyperlink"/>
@@ -2042,7 +1847,7 @@
       <w:pPr>
         <w:spacing w:after="140"/>
       </w:pPr>
-      <w:hyperlink w:history="1" r:id="rIdbnuuiidmswmxgmlewzxtj">
+      <w:hyperlink w:history="1" r:id="rIdc-mbevsqvzhpp3nwkxm55">
         <w:r>
           <w:rPr>
             <w:rStyle w:val="Hyperlink"/>
@@ -2116,7 +1921,7 @@
         <w:spacing w:after="140"/>
       </w:pPr>
       <w:r>
-        <w:t xml:space="preserve">No. You can send action items to Jira and share notes with a link.</w:t>
+        <w:t xml:space="preserve">No. You can send tasks to Jira and share notes with a link.</w:t>
       </w:r>
     </w:p>
     <w:p>
@@ -2287,7 +2092,7 @@
         <w:sz w:val="16"/>
         <w:szCs w:val="16"/>
       </w:rPr>
-      <w:t xml:space="preserve">Lynkk · Sales Calls Page: Storytelling Draft · </w:t>
+      <w:t xml:space="preserve">Lynkk · Sales Calls Page: Storytelling Draft (v2) · </w:t>
     </w:r>
     <w:r>
       <w:rPr>

</xml_diff>

<commit_message>
Rewrite sales calls draft as a simple story
Co-Authored-By: Claude Opus 5.5 <noreply@anthropic.com>
Claude-Session: https://claude.ai/code/session_01Xs6uEGTRa4UggVmKjUH61X
</commit_message>
<xml_diff>
--- a/content/use-cases/story-drafts/Lynkk-Sales-Calls-Story-Draft.docx
+++ b/content/use-cases/story-drafts/Lynkk-Sales-Calls-Story-Draft.docx
@@ -7,7 +7,7 @@
         <w:pStyle w:val="Title"/>
       </w:pPr>
       <w:r>
-        <w:t xml:space="preserve">Sales Calls Page: Storytelling Draft (v2)</w:t>
+        <w:t xml:space="preserve">Sales Calls Page: Storytelling Draft (v3, simple story)</w:t>
       </w:r>
     </w:p>
     <w:p>
@@ -20,7 +20,7 @@
         <w:ind w:left="360"/>
       </w:pPr>
       <w:r>
-        <w:t xml:space="preserve">Draft for review, 2026-10-17. Page: lynkk.ai/use-cases/sales-calls. The story follows Maya, an example sales rep, and Bluestone Logistics Ltd., an example company. Neither is a real customer.</w:t>
+        <w:t xml:space="preserve">Draft for review, 2026-10-17. Page: lynkk.ai/use-cases/sales-calls. Maya and Bluestone Logistics Ltd. are examples, not real customers. Written in short, simple sentences so anyone can follow the story.</w:t>
       </w:r>
     </w:p>
     <w:p>
@@ -309,7 +309,7 @@
                 <w:sz w:val="19"/>
                 <w:szCs w:val="19"/>
               </w:rPr>
-              <w:t xml:space="preserve">Title, "What is Lynkk" section, features heading</w:t>
+              <w:t xml:space="preserve">Title, "So, what is Lynkk?" section</w:t>
             </w:r>
           </w:p>
         </w:tc>
@@ -475,7 +475,7 @@
                 <w:sz w:val="19"/>
                 <w:szCs w:val="19"/>
               </w:rPr>
-              <w:t xml:space="preserve">Meta description, "What is Lynkk" section</w:t>
+              <w:t xml:space="preserve">Meta description, "So, what is Lynkk?" section</w:t>
             </w:r>
           </w:p>
         </w:tc>
@@ -641,7 +641,7 @@
                 <w:sz w:val="19"/>
                 <w:szCs w:val="19"/>
               </w:rPr>
-              <w:t xml:space="preserve">Story heading, "What is Lynkk" section</w:t>
+              <w:t xml:space="preserve">Story heading, "So, what is Lynkk?" section</w:t>
             </w:r>
           </w:p>
         </w:tc>
@@ -957,15 +957,15 @@
         <w:pStyle w:val="Heading1"/>
       </w:pPr>
       <w:r>
-        <w:t xml:space="preserve">AI for sales calls: record every call, get the next steps written for you.</w:t>
-      </w:r>
-    </w:p>
-    <w:p>
-      <w:pPr>
-        <w:spacing w:after="140"/>
-      </w:pPr>
-      <w:r>
-        <w:t xml:space="preserve">Lynkk is AI for sales teams who would rather sell than type. It records your sales call and writes the next steps, the decisions and the open questions for you.</w:t>
+        <w:t xml:space="preserve">AI for sales calls: you talk, Lynkk writes the notes.</w:t>
+      </w:r>
+    </w:p>
+    <w:p>
+      <w:pPr>
+        <w:spacing w:after="140"/>
+      </w:pPr>
+      <w:r>
+        <w:t xml:space="preserve">Lynkk is AI for sales. It listens to your sales call and writes down what matters, so you can focus on the buyer.</w:t>
       </w:r>
     </w:p>
     <w:p>
@@ -981,7 +981,7 @@
         <w:pStyle w:val="Heading1"/>
       </w:pPr>
       <w:r>
-        <w:t xml:space="preserve">A sales call story you might know</w:t>
+        <w:t xml:space="preserve">Meet Maya</w:t>
       </w:r>
     </w:p>
     <w:p>
@@ -993,31 +993,23 @@
           <w:i/>
           <w:iCs/>
         </w:rPr>
-        <w:t xml:space="preserve">Meet Maya, a sales rep. She's an example, but you may know someone just like her.</w:t>
-      </w:r>
-    </w:p>
-    <w:p>
-      <w:pPr>
-        <w:spacing w:after="140"/>
-      </w:pPr>
-      <w:r>
-        <w:t xml:space="preserve">Maya has a sales call with Dana from Bluestone Logistics Ltd. Dana asks about the price, wants to try the product with two teams first, and isn't sure who on her side will sign the order.</w:t>
-      </w:r>
-    </w:p>
-    <w:p>
-      <w:pPr>
-        <w:spacing w:after="140"/>
-      </w:pPr>
-      <w:r>
-        <w:t xml:space="preserve">Maya is selling, listening and typing notes all at once. After the call, her notes are half done. She can't remember when she promised the new quote, and Dana's question about who signs the order is gone.</w:t>
-      </w:r>
-    </w:p>
-    <w:p>
-      <w:pPr>
-        <w:spacing w:after="140"/>
-      </w:pPr>
-      <w:r>
-        <w:t xml:space="preserve">The follow-up email goes out late. Small things slip, and the deal slows down.</w:t>
+        <w:t xml:space="preserve">Maya is an example. But you may know someone just like her.</w:t>
+      </w:r>
+    </w:p>
+    <w:p>
+      <w:pPr>
+        <w:spacing w:after="140"/>
+      </w:pPr>
+      <w:r>
+        <w:t xml:space="preserve">Maya sells software. She has many sales calls every day.</w:t>
+      </w:r>
+    </w:p>
+    <w:p>
+      <w:pPr>
+        <w:spacing w:after="140"/>
+      </w:pPr>
+      <w:r>
+        <w:t xml:space="preserve">Today she is talking to Dana from Bluestone Logistics Ltd. Dana is interested. She asks about the price. She wants to try it with two teams first. And she is not sure who will sign the order.</w:t>
       </w:r>
     </w:p>
     <w:p>
@@ -1025,15 +1017,47 @@
         <w:pStyle w:val="Heading1"/>
       </w:pPr>
       <w:r>
-        <w:t xml:space="preserve">How an AI sales assistant helps Maya</w:t>
-      </w:r>
-    </w:p>
-    <w:p>
-      <w:pPr>
-        <w:spacing w:after="140"/>
-      </w:pPr>
-      <w:r>
-        <w:t xml:space="preserve">On her next call with Bluestone Logistics, Maya uses Lynkk.</w:t>
+        <w:t xml:space="preserve">Maya's problem</w:t>
+      </w:r>
+    </w:p>
+    <w:p>
+      <w:pPr>
+        <w:spacing w:after="140"/>
+      </w:pPr>
+      <w:r>
+        <w:t xml:space="preserve">Maya is doing three things at once. She is talking. She is listening. And she is typing notes.</w:t>
+      </w:r>
+    </w:p>
+    <w:p>
+      <w:pPr>
+        <w:spacing w:after="140"/>
+      </w:pPr>
+      <w:r>
+        <w:t xml:space="preserve">After the call, her notes are a mess. She forgot when she promised the price quote. She forgot Dana's question about who signs the order.</w:t>
+      </w:r>
+    </w:p>
+    <w:p>
+      <w:pPr>
+        <w:spacing w:after="140"/>
+      </w:pPr>
+      <w:r>
+        <w:t xml:space="preserve">So the follow-up email is late. A few small things slip. And the deal slows down.</w:t>
+      </w:r>
+    </w:p>
+    <w:p>
+      <w:pPr>
+        <w:pStyle w:val="Heading1"/>
+      </w:pPr>
+      <w:r>
+        <w:t xml:space="preserve">How Lynkk helps Maya on her next sales call</w:t>
+      </w:r>
+    </w:p>
+    <w:p>
+      <w:pPr>
+        <w:spacing w:after="140"/>
+      </w:pPr>
+      <w:r>
+        <w:t xml:space="preserve">Maya starts using Lynkk, an AI sales assistant. Here is what changes.</w:t>
       </w:r>
     </w:p>
     <w:p>
@@ -1045,20 +1069,10 @@
           <w:b/>
           <w:bCs/>
         </w:rPr>
-        <w:t xml:space="preserve">Before the call:</w:t>
-      </w:r>
-      <w:r>
-        <w:t xml:space="preserve"> Maya asks Lynkk, </w:t>
-      </w:r>
-      <w:r>
-        <w:rPr>
-          <w:i/>
-          <w:iCs/>
-        </w:rPr>
-        <w:t xml:space="preserve">"What's still open with Bluestone?"</w:t>
-      </w:r>
-      <w:r>
-        <w:t xml:space="preserve"> Lynkk reminds her that Dana still hasn't said who signs the order. Maya starts the call with that question.</w:t>
+        <w:t xml:space="preserve">Before the call, Maya asks Lynkk one question.</w:t>
+      </w:r>
+      <w:r>
+        <w:t xml:space="preserve"> "What is still open with Bluestone?" Lynkk replies: "Dana has not said who will sign the order." Now Maya knows what to ask first.</w:t>
       </w:r>
     </w:p>
     <w:p>
@@ -1070,10 +1084,10 @@
           <w:b/>
           <w:bCs/>
         </w:rPr>
-        <w:t xml:space="preserve">During the call:</w:t>
-      </w:r>
-      <w:r>
-        <w:t xml:space="preserve"> Lynkk records the call from her Mac, so no bot joins. Maya just listens and talks. When Dana asks what they agreed last time, Lynkk's Cue gives Maya the answer during the call.</w:t>
+        <w:t xml:space="preserve">During the call, Maya just talks.</w:t>
+      </w:r>
+      <w:r>
+        <w:t xml:space="preserve"> Lynkk records the call from her computer. No extra bot joins the call. When Dana asks, "What did we agree last time?", Lynkk shows Maya the answer right away.</w:t>
       </w:r>
     </w:p>
     <w:p>
@@ -1085,22 +1099,10 @@
           <w:b/>
           <w:bCs/>
         </w:rPr>
-        <w:t xml:space="preserve">After the call:</w:t>
-      </w:r>
-      <w:r>
-        <w:t xml:space="preserve"> the note is ready before Maya opens her inbox. Every next step has an owner and a date. She writes the follow-up from the note and sends the tasks to Jira.</w:t>
-      </w:r>
-    </w:p>
-    <w:p>
-      <w:pPr>
-        <w:spacing w:after="140"/>
-      </w:pPr>
-      <w:r>
-        <w:rPr>
-          <w:i/>
-          <w:iCs/>
-        </w:rPr>
-        <w:t xml:space="preserve">Asking Lynkk across calls and Cue during calls are part of Pro.</w:t>
+        <w:t xml:space="preserve">After the call, the notes are already done.</w:t>
+      </w:r>
+      <w:r>
+        <w:t xml:space="preserve"> Maya does not type anything. Lynkk writes the next steps, who will do them, and by when.</w:t>
       </w:r>
     </w:p>
     <w:p>
@@ -1108,7 +1110,7 @@
         <w:pStyle w:val="Heading2"/>
       </w:pPr>
       <w:r>
-        <w:t xml:space="preserve">Maya's note from the call (example)</w:t>
+        <w:t xml:space="preserve">Here is the note Lynkk wrote for Maya (example)</w:t>
       </w:r>
     </w:p>
     <w:p>
@@ -1120,7 +1122,7 @@
           <w:b/>
           <w:bCs/>
         </w:rPr>
-        <w:t xml:space="preserve">Bluestone Logistics Ltd. pricing call · Zoom · 32 min</w:t>
+        <w:t xml:space="preserve">Call with Bluestone Logistics Ltd. · Zoom · 32 min</w:t>
       </w:r>
     </w:p>
     <w:p>
@@ -1144,7 +1146,7 @@
         </w:numPr>
       </w:pPr>
       <w:r>
-        <w:t xml:space="preserve">Send the new quote to Dana. Owner: Maya. Due: Fri 2 Oct.</w:t>
+        <w:t xml:space="preserve">Send the new price quote to Dana. Who: Maya. When: Friday.</w:t>
       </w:r>
     </w:p>
     <w:p>
@@ -1156,7 +1158,7 @@
         </w:numPr>
       </w:pPr>
       <w:r>
-        <w:t xml:space="preserve">Book the security review. Owner: Dev. Due: Tue 6 Oct.</w:t>
+        <w:t xml:space="preserve">Book a security check. Who: Dev. When: Tuesday.</w:t>
       </w:r>
     </w:p>
     <w:p>
@@ -1168,10 +1170,10 @@
           <w:b/>
           <w:bCs/>
         </w:rPr>
-        <w:t xml:space="preserve">Decision:</w:t>
-      </w:r>
-      <w:r>
-        <w:t xml:space="preserve"> Start with a pilot for two teams. Agreed at 14:22.</w:t>
+        <w:t xml:space="preserve">What we agreed:</w:t>
+      </w:r>
+      <w:r>
+        <w:t xml:space="preserve"> Start with two teams first.</w:t>
       </w:r>
     </w:p>
     <w:p>
@@ -1183,18 +1185,18 @@
           <w:b/>
           <w:bCs/>
         </w:rPr>
-        <w:t xml:space="preserve">Open question:</w:t>
-      </w:r>
-      <w:r>
-        <w:t xml:space="preserve"> Who signs the order on Bluestone's side? Raised at 21:37.</w:t>
-      </w:r>
-    </w:p>
-    <w:p>
-      <w:pPr>
-        <w:spacing w:after="140"/>
-      </w:pPr>
-      <w:r>
-        <w:t xml:space="preserve">Click any time in the note and the recording plays from that moment.</w:t>
+        <w:t xml:space="preserve">Still open:</w:t>
+      </w:r>
+      <w:r>
+        <w:t xml:space="preserve"> Who will sign the order at Bluestone?</w:t>
+      </w:r>
+    </w:p>
+    <w:p>
+      <w:pPr>
+        <w:spacing w:after="140"/>
+      </w:pPr>
+      <w:r>
+        <w:t xml:space="preserve">Maya can click any line to hear that part of the call again.</w:t>
       </w:r>
     </w:p>
     <w:p>
@@ -1202,27 +1204,23 @@
         <w:pStyle w:val="Heading1"/>
       </w:pPr>
       <w:r>
-        <w:t xml:space="preserve">What is Lynkk, in simple words?</w:t>
-      </w:r>
-    </w:p>
-    <w:p>
-      <w:pPr>
-        <w:spacing w:after="140"/>
-      </w:pPr>
-      <w:r>
-        <w:t xml:space="preserve">Lynkk is an AI sales assistant and conversation intelligence platform. It listens to your sales call, writes down what matters, and remembers it for next time. You get the next steps, who owns them, the decisions and the open questions. Later, you can ask Lynkk about any client, and each answer shows which call it came from.</w:t>
-      </w:r>
-    </w:p>
-    <w:p>
-      <w:pPr>
-        <w:spacing w:after="140"/>
-      </w:pPr>
-      <w:r>
-        <w:rPr>
-          <w:b/>
-          <w:bCs/>
-        </w:rPr>
-        <w:t xml:space="preserve">Who it's for</w:t>
+        <w:t xml:space="preserve">So, what is Lynkk?</w:t>
+      </w:r>
+    </w:p>
+    <w:p>
+      <w:pPr>
+        <w:spacing w:after="140"/>
+      </w:pPr>
+      <w:r>
+        <w:t xml:space="preserve">Lynkk is an AI note taker for sales calls. Some people call this kind of tool a conversation intelligence platform. It simply means software that listens to your calls and helps you remember them.</w:t>
+      </w:r>
+    </w:p>
+    <w:p>
+      <w:pPr>
+        <w:spacing w:after="140"/>
+      </w:pPr>
+      <w:r>
+        <w:t xml:space="preserve">With Lynkk, you get three things:</w:t>
       </w:r>
     </w:p>
     <w:p>
@@ -1234,7 +1232,14 @@
         </w:numPr>
       </w:pPr>
       <w:r>
-        <w:t xml:space="preserve">Sales reps who run many calls a day</w:t>
+        <w:rPr>
+          <w:b/>
+          <w:bCs/>
+        </w:rPr>
+        <w:t xml:space="preserve">Notes:</w:t>
+      </w:r>
+      <w:r>
+        <w:t xml:space="preserve"> what was said, what was agreed, and what is still open.</w:t>
       </w:r>
     </w:p>
     <w:p>
@@ -1246,7 +1251,14 @@
         </w:numPr>
       </w:pPr>
       <w:r>
-        <w:t xml:space="preserve">Founders who do their own selling</w:t>
+        <w:rPr>
+          <w:b/>
+          <w:bCs/>
+        </w:rPr>
+        <w:t xml:space="preserve">Next steps:</w:t>
+      </w:r>
+      <w:r>
+        <w:t xml:space="preserve"> each task with a name and a date.</w:t>
       </w:r>
     </w:p>
     <w:p>
@@ -1258,7 +1270,66 @@
         </w:numPr>
       </w:pPr>
       <w:r>
-        <w:t xml:space="preserve">Account managers who need to remember every client</w:t>
+        <w:rPr>
+          <w:b/>
+          <w:bCs/>
+        </w:rPr>
+        <w:t xml:space="preserve">Memory:</w:t>
+      </w:r>
+      <w:r>
+        <w:t xml:space="preserve"> ask Lynkk about any past call, and it shows you where the answer came from.</w:t>
+      </w:r>
+    </w:p>
+    <w:p>
+      <w:pPr>
+        <w:pStyle w:val="Heading1"/>
+      </w:pPr>
+      <w:r>
+        <w:t xml:space="preserve">Is Lynkk right for you?</w:t>
+      </w:r>
+    </w:p>
+    <w:p>
+      <w:pPr>
+        <w:spacing w:after="140"/>
+      </w:pPr>
+      <w:r>
+        <w:t xml:space="preserve">Lynkk is for you if:</w:t>
+      </w:r>
+    </w:p>
+    <w:p>
+      <w:pPr>
+        <w:pStyle w:val="ListParagraph"/>
+        <w:numPr>
+          <w:ilvl w:val="0"/>
+          <w:numId w:val="2"/>
+        </w:numPr>
+      </w:pPr>
+      <w:r>
+        <w:t xml:space="preserve">You are a sales rep with many calls a day.</w:t>
+      </w:r>
+    </w:p>
+    <w:p>
+      <w:pPr>
+        <w:pStyle w:val="ListParagraph"/>
+        <w:numPr>
+          <w:ilvl w:val="0"/>
+          <w:numId w:val="2"/>
+        </w:numPr>
+      </w:pPr>
+      <w:r>
+        <w:t xml:space="preserve">You are a founder who sells your own product.</w:t>
+      </w:r>
+    </w:p>
+    <w:p>
+      <w:pPr>
+        <w:pStyle w:val="ListParagraph"/>
+        <w:numPr>
+          <w:ilvl w:val="0"/>
+          <w:numId w:val="2"/>
+        </w:numPr>
+      </w:pPr>
+      <w:r>
+        <w:t xml:space="preserve">You look after clients and need to remember every promise.</w:t>
       </w:r>
     </w:p>
     <w:p>
@@ -1376,7 +1447,7 @@
                 <w:sz w:val="19"/>
                 <w:szCs w:val="19"/>
               </w:rPr>
-              <w:t xml:space="preserve">You type notes while the buyer talks</w:t>
+              <w:t xml:space="preserve">You type while the buyer talks</w:t>
             </w:r>
           </w:p>
         </w:tc>
@@ -1402,7 +1473,7 @@
                 <w:sz w:val="19"/>
                 <w:szCs w:val="19"/>
               </w:rPr>
-              <w:t xml:space="preserve">You listen, and Lynkk writes the notes</w:t>
+              <w:t xml:space="preserve">You listen. Lynkk writes.</w:t>
             </w:r>
           </w:p>
         </w:tc>
@@ -1433,7 +1504,7 @@
                 <w:sz w:val="19"/>
                 <w:szCs w:val="19"/>
               </w:rPr>
-              <w:t xml:space="preserve">Next steps get lost after the call</w:t>
+              <w:t xml:space="preserve">Tasks get lost after the call</w:t>
             </w:r>
           </w:p>
         </w:tc>
@@ -1459,7 +1530,7 @@
                 <w:sz w:val="19"/>
                 <w:szCs w:val="19"/>
               </w:rPr>
-              <w:t xml:space="preserve">Every next step has an owner and a date</w:t>
+              <w:t xml:space="preserve">Every task has a name and a date</w:t>
             </w:r>
           </w:p>
         </w:tc>
@@ -1490,7 +1561,7 @@
                 <w:sz w:val="19"/>
                 <w:szCs w:val="19"/>
               </w:rPr>
-              <w:t xml:space="preserve">You dig through old emails before each call</w:t>
+              <w:t xml:space="preserve">You search old emails before a call</w:t>
             </w:r>
           </w:p>
         </w:tc>
@@ -1516,7 +1587,7 @@
                 <w:sz w:val="19"/>
                 <w:szCs w:val="19"/>
               </w:rPr>
-              <w:t xml:space="preserve">You ask Lynkk what's still open</w:t>
+              <w:t xml:space="preserve">You ask Lynkk what is still open</w:t>
             </w:r>
           </w:p>
         </w:tc>
@@ -1532,82 +1603,83 @@
         <w:pStyle w:val="Heading1"/>
       </w:pPr>
       <w:r>
-        <w:t xml:space="preserve">Conversation intelligence for every sales call</w:t>
-      </w:r>
-    </w:p>
-    <w:p>
-      <w:pPr>
-        <w:spacing w:after="140"/>
+        <w:t xml:space="preserve">What else can Lynkk do?</w:t>
+      </w:r>
+    </w:p>
+    <w:p>
+      <w:pPr>
+        <w:pStyle w:val="ListParagraph"/>
+        <w:numPr>
+          <w:ilvl w:val="0"/>
+          <w:numId w:val="2"/>
+        </w:numPr>
       </w:pPr>
       <w:r>
         <w:rPr>
           <w:b/>
           <w:bCs/>
         </w:rPr>
-        <w:t xml:space="preserve">Next steps with owners:</w:t>
-      </w:r>
-      <w:r>
-        <w:t xml:space="preserve"> every task gets an owner, a due date and a priority.</w:t>
-      </w:r>
-    </w:p>
-    <w:p>
-      <w:pPr>
-        <w:spacing w:after="140"/>
+        <w:t xml:space="preserve">Record face-to-face meetings too.</w:t>
+      </w:r>
+      <w:r>
+        <w:t xml:space="preserve"> Meeting a buyer in person? Lynkk can record that too, even without internet.</w:t>
+      </w:r>
+    </w:p>
+    <w:p>
+      <w:pPr>
+        <w:pStyle w:val="ListParagraph"/>
+        <w:numPr>
+          <w:ilvl w:val="0"/>
+          <w:numId w:val="2"/>
+        </w:numPr>
       </w:pPr>
       <w:r>
         <w:rPr>
           <w:b/>
           <w:bCs/>
         </w:rPr>
-        <w:t xml:space="preserve">Ask across calls:</w:t>
-      </w:r>
-      <w:r>
-        <w:t xml:space="preserve"> "What did Bluestone say about price?" Each answer shows which call it came from.</w:t>
-      </w:r>
-    </w:p>
-    <w:p>
-      <w:pPr>
-        <w:spacing w:after="140"/>
+        <w:t xml:space="preserve">Work without a bot.</w:t>
+      </w:r>
+      <w:r>
+        <w:t xml:space="preserve"> Record from your computer, so no extra guest joins the call.</w:t>
+      </w:r>
+    </w:p>
+    <w:p>
+      <w:pPr>
+        <w:pStyle w:val="ListParagraph"/>
+        <w:numPr>
+          <w:ilvl w:val="0"/>
+          <w:numId w:val="2"/>
+        </w:numPr>
       </w:pPr>
       <w:r>
         <w:rPr>
           <w:b/>
           <w:bCs/>
         </w:rPr>
-        <w:t xml:space="preserve">Record in person, even offline:</w:t>
-      </w:r>
-      <w:r>
-        <w:t xml:space="preserve"> meeting a buyer face to face? Record with the Mac app or web app. It uploads when you're back online.</w:t>
-      </w:r>
-    </w:p>
-    <w:p>
-      <w:pPr>
-        <w:spacing w:after="140"/>
+        <w:t xml:space="preserve">Send tasks to Jira.</w:t>
+      </w:r>
+      <w:r>
+        <w:t xml:space="preserve"> Turn next steps into Jira tasks.</w:t>
+      </w:r>
+    </w:p>
+    <w:p>
+      <w:pPr>
+        <w:pStyle w:val="ListParagraph"/>
+        <w:numPr>
+          <w:ilvl w:val="0"/>
+          <w:numId w:val="2"/>
+        </w:numPr>
       </w:pPr>
       <w:r>
         <w:rPr>
           <w:b/>
           <w:bCs/>
         </w:rPr>
-        <w:t xml:space="preserve">No bot needed:</w:t>
-      </w:r>
-      <w:r>
-        <w:t xml:space="preserve"> the Mac app and Chrome extension record from your computer. Prefer a bot? It joins from your calendar.</w:t>
-      </w:r>
-    </w:p>
-    <w:p>
-      <w:pPr>
-        <w:spacing w:after="140"/>
-      </w:pPr>
-      <w:r>
-        <w:rPr>
-          <w:b/>
-          <w:bCs/>
-        </w:rPr>
-        <w:t xml:space="preserve">Works with:</w:t>
-      </w:r>
-      <w:r>
-        <w:t xml:space="preserve"> Zoom, Google Meet, Microsoft Teams, Webex, Google Calendar and Jira.</w:t>
+        <w:t xml:space="preserve">Work with your tools.</w:t>
+      </w:r>
+      <w:r>
+        <w:t xml:space="preserve"> Zoom, Google Meet, Microsoft Teams, Webex and Google Calendar.</w:t>
       </w:r>
     </w:p>
     <w:p>
@@ -1615,22 +1687,22 @@
         <w:pStyle w:val="Heading1"/>
       </w:pPr>
       <w:r>
-        <w:t xml:space="preserve">Private by default</w:t>
-      </w:r>
-    </w:p>
-    <w:p>
-      <w:pPr>
-        <w:spacing w:after="140"/>
-      </w:pPr>
-      <w:r>
-        <w:t xml:space="preserve">Your data region (US, EU, UK, India, Singapore or Australia) · AES-256 encryption · Never used for training · Consent flow for recording. </w:t>
-      </w:r>
-      <w:hyperlink w:history="1" r:id="rId7ccy9iaqpvvqnceb9d3yk">
+        <w:t xml:space="preserve">Your calls stay private</w:t>
+      </w:r>
+    </w:p>
+    <w:p>
+      <w:pPr>
+        <w:spacing w:after="140"/>
+      </w:pPr>
+      <w:r>
+        <w:t xml:space="preserve">Your notes are private unless you share them. Your data is encrypted and stays in the region you choose. Lynkk never uses your calls to train AI. </w:t>
+      </w:r>
+      <w:hyperlink w:history="1" r:id="rIdntra2l9f1kxt65izsrodq">
         <w:r>
           <w:rPr>
             <w:rStyle w:val="Hyperlink"/>
           </w:rPr>
-          <w:t xml:space="preserve">Security</w:t>
+          <w:t xml:space="preserve">Read about security</w:t>
         </w:r>
       </w:hyperlink>
     </w:p>
@@ -1806,7 +1878,7 @@
                 <w:sz w:val="19"/>
                 <w:szCs w:val="19"/>
               </w:rPr>
-              <w:t xml:space="preserve">Record meetings and get AI notes and action items. No credit card.</w:t>
+              <w:t xml:space="preserve">Record calls and get AI notes and next steps. No credit card.</w:t>
             </w:r>
           </w:p>
         </w:tc>
@@ -1832,7 +1904,7 @@
                 <w:sz w:val="19"/>
                 <w:szCs w:val="19"/>
               </w:rPr>
-              <w:t xml:space="preserve">Unlimited notes, plus the Sales Call note format, Cue answers during the call, and Ask Lynkk across every call.</w:t>
+              <w:t xml:space="preserve">Everything in Free, plus unlimited notes, answers during calls, and asking Lynkk about past calls.</w:t>
             </w:r>
           </w:p>
         </w:tc>
@@ -1847,7 +1919,7 @@
       <w:pPr>
         <w:spacing w:after="140"/>
       </w:pPr>
-      <w:hyperlink w:history="1" r:id="rIdc-mbevsqvzhpp3nwkxm55">
+      <w:hyperlink w:history="1" r:id="rId_ud5ho2gb0wyy9lj-kfj8">
         <w:r>
           <w:rPr>
             <w:rStyle w:val="Hyperlink"/>
@@ -1861,7 +1933,7 @@
         <w:pStyle w:val="Heading1"/>
       </w:pPr>
       <w:r>
-        <w:t xml:space="preserve">Questions about AI for sales calls</w:t>
+        <w:t xml:space="preserve">Questions people ask</w:t>
       </w:r>
     </w:p>
     <w:p>
@@ -1881,7 +1953,7 @@
         <w:spacing w:after="140"/>
       </w:pPr>
       <w:r>
-        <w:t xml:space="preserve">Yes, and more. Lynkk records your sales calls, then writes the notes, next steps and open questions for you.</w:t>
+        <w:t xml:space="preserve">Yes, and more. Lynkk records your sales calls and also writes the notes for you.</w:t>
       </w:r>
     </w:p>
     <w:p>
@@ -1893,15 +1965,15 @@
           <w:b/>
           <w:bCs/>
         </w:rPr>
-        <w:t xml:space="preserve">Can Lynkk record without a bot joining?</w:t>
-      </w:r>
-    </w:p>
-    <w:p>
-      <w:pPr>
-        <w:spacing w:after="140"/>
-      </w:pPr>
-      <w:r>
-        <w:t xml:space="preserve">Yes. The Mac app and Chrome extension record from your computer. The bot is optional.</w:t>
+        <w:t xml:space="preserve">Does a bot join my call?</w:t>
+      </w:r>
+    </w:p>
+    <w:p>
+      <w:pPr>
+        <w:spacing w:after="140"/>
+      </w:pPr>
+      <w:r>
+        <w:t xml:space="preserve">No, not unless you want one. Lynkk can record from your computer.</w:t>
       </w:r>
     </w:p>
     <w:p>
@@ -1913,15 +1985,15 @@
           <w:b/>
           <w:bCs/>
         </w:rPr>
-        <w:t xml:space="preserve">Does Lynkk sync with my CRM?</w:t>
-      </w:r>
-    </w:p>
-    <w:p>
-      <w:pPr>
-        <w:spacing w:after="140"/>
-      </w:pPr>
-      <w:r>
-        <w:t xml:space="preserve">No. You can send tasks to Jira and share notes with a link.</w:t>
+        <w:t xml:space="preserve">Does Lynkk work with my CRM?</w:t>
+      </w:r>
+    </w:p>
+    <w:p>
+      <w:pPr>
+        <w:spacing w:after="140"/>
+      </w:pPr>
+      <w:r>
+        <w:t xml:space="preserve">Not yet. Today you can send tasks to Jira and share notes with a link.</w:t>
       </w:r>
     </w:p>
     <w:p>
@@ -1941,7 +2013,7 @@
         <w:spacing w:after="140"/>
       </w:pPr>
       <w:r>
-        <w:t xml:space="preserve">Lynkk focuses on the conversation: notes, next steps and answers across calls, online or in person. Revenue platforms add CRM sync and forecasting.</w:t>
+        <w:t xml:space="preserve">Many AI sales tools focus on reports and forecasts. Lynkk focuses on the call itself: clear notes, clear next steps, and a memory of every conversation.</w:t>
       </w:r>
     </w:p>
     <w:p>
@@ -1953,15 +2025,15 @@
           <w:b/>
           <w:bCs/>
         </w:rPr>
-        <w:t xml:space="preserve">Do I need to tell the buyer I'm recording?</w:t>
-      </w:r>
-    </w:p>
-    <w:p>
-      <w:pPr>
-        <w:spacing w:after="140"/>
-      </w:pPr>
-      <w:r>
-        <w:t xml:space="preserve">Yes. Recording rules differ by country and state, so tell the buyer at the start and record only with their agreement.</w:t>
+        <w:t xml:space="preserve">Do I need to tell the buyer I am recording?</w:t>
+      </w:r>
+    </w:p>
+    <w:p>
+      <w:pPr>
+        <w:spacing w:after="140"/>
+      </w:pPr>
+      <w:r>
+        <w:t xml:space="preserve">Yes. Always ask the buyer first. Rules are different in each country.</w:t>
       </w:r>
     </w:p>
     <w:p>
@@ -1969,15 +2041,15 @@
         <w:pStyle w:val="Heading1"/>
       </w:pPr>
       <w:r>
-        <w:t xml:space="preserve">Be the rep who never forgets a next step.</w:t>
-      </w:r>
-    </w:p>
-    <w:p>
-      <w:pPr>
-        <w:spacing w:after="140"/>
-      </w:pPr>
-      <w:r>
-        <w:t xml:space="preserve">Record your next sales call with Lynkk, and read the next steps after.</w:t>
+        <w:t xml:space="preserve">Be like Maya. Never forget a next step again.</w:t>
+      </w:r>
+    </w:p>
+    <w:p>
+      <w:pPr>
+        <w:spacing w:after="140"/>
+      </w:pPr>
+      <w:r>
+        <w:t xml:space="preserve">Try Lynkk on your next sales call. It's free to start.</w:t>
       </w:r>
     </w:p>
     <w:p>
@@ -2013,7 +2085,19 @@
         </w:numPr>
       </w:pPr>
       <w:r>
-        <w:t xml:space="preserve">How Cue shows answers during a call, so the "During the call" part of the story is accurate</w:t>
+        <w:t xml:space="preserve">How Cue shows answers during a call ("Lynkk shows Maya the answer right away")</w:t>
+      </w:r>
+    </w:p>
+    <w:p>
+      <w:pPr>
+        <w:pStyle w:val="ListParagraph"/>
+        <w:numPr>
+          <w:ilvl w:val="0"/>
+          <w:numId w:val="2"/>
+        </w:numPr>
+      </w:pPr>
+      <w:r>
+        <w:t xml:space="preserve">"Not yet" in the CRM answer: only keep "yet" if CRM sync is planned</w:t>
       </w:r>
     </w:p>
     <w:p>
@@ -2092,7 +2176,7 @@
         <w:sz w:val="16"/>
         <w:szCs w:val="16"/>
       </w:rPr>
-      <w:t xml:space="preserve">Lynkk · Sales Calls Page: Storytelling Draft (v2) · </w:t>
+      <w:t xml:space="preserve">Lynkk · Sales Calls Page: Storytelling Draft (v3, simple story) · </w:t>
     </w:r>
     <w:r>
       <w:rPr>

</xml_diff>